<commit_message>
v4.1.0: DOCX image fix, clean vscodeignore
</commit_message>
<xml_diff>
--- a/README_export.docx
+++ b/README_export.docx
@@ -2,13 +2,13 @@
 <file path=word/document.xml><?xml version="1.0" encoding="utf-8"?>
 <w:document xmlns:w="http://schemas.openxmlformats.org/wordprocessingml/2006/main" xmlns:m="http://schemas.openxmlformats.org/officeDocument/2006/math" xmlns:r="http://schemas.openxmlformats.org/officeDocument/2006/relationships" xmlns:o="urn:schemas-microsoft-com:office:office" xmlns:v="urn:schemas-microsoft-com:vml" xmlns:w10="urn:schemas-microsoft-com:office:word" xmlns:a="http://schemas.openxmlformats.org/drawingml/2006/main" xmlns:pic="http://schemas.openxmlformats.org/drawingml/2006/picture" xmlns:wp="http://schemas.openxmlformats.org/drawingml/2006/wordprocessingDrawing">
   <w:body>
-    <w:bookmarkStart w:id="37" w:name="markdown-review"/>
+    <w:bookmarkStart w:id="40" w:name="markdown-reader-with-copilot"/>
     <w:p>
       <w:pPr>
         <w:pStyle w:val="Heading1"/>
       </w:pPr>
       <w:r>
-        <w:t xml:space="preserve">Markdown Review</w:t>
+        <w:t xml:space="preserve">Markdown Reader with Copilot</w:t>
       </w:r>
     </w:p>
     <w:p>
@@ -20,7 +20,7 @@
           <w:b/>
           <w:bCs/>
         </w:rPr>
-        <w:t xml:space="preserve">The most agent-friendly markdown review extension for VS Code.</w:t>
+        <w:t xml:space="preserve">The most agent-friendly markdown reader and review extension for VS Code.</w:t>
       </w:r>
     </w:p>
     <w:p>
@@ -28,7 +28,7 @@
         <w:pStyle w:val="BodyText"/>
       </w:pPr>
       <w:r>
-        <w:t xml:space="preserve">Markdown Review brings Quip/Google Docs-style inline commenting to your markdown files — directly inside VS Code. Add comments, reply in threads, resolve discussions, and let AI agents participate in the review via 7 built-in Copilot tools. Perfect for document reviews, design proposals, and technical specifications.</w:t>
+        <w:t xml:space="preserve">Markdown Reader with Copilot brings Quip/Google Docs-style inline commenting to your markdown files — directly inside VS Code. Read, preview, comment, reply in threads, resolve discussions, and let AI agents participate in the review via 7 built-in Copilot tools and one-click ✨ Ask Copilot buttons. Perfect for document reviews, design proposals, and technical specifications.</w:t>
       </w:r>
     </w:p>
     <w:p>
@@ -211,7 +211,63 @@
         <w:t xml:space="preserve"> </w:t>
       </w:r>
       <w:r>
-        <w:t xml:space="preserve">button in the gutter next to any block (heading, paragraph, table, formula, list, blockquote) to add a comment. Reply to comments, edit them, or mark them resolved — all inline.</w:t>
+        <w:t xml:space="preserve">button in the gutter next to any block (heading, paragraph, table, formula, list, blockquote) to add a comment. Reply to comments, edit them, or mark them resolved — all inline. You can also click</w:t>
+      </w:r>
+      <w:r>
+        <w:t xml:space="preserve"> </w:t>
+      </w:r>
+      <w:r>
+        <w:rPr>
+          <w:b/>
+          <w:bCs/>
+        </w:rPr>
+        <w:t xml:space="preserve">✨ Ask Copilot</w:t>
+      </w:r>
+      <w:r>
+        <w:t xml:space="preserve"> </w:t>
+      </w:r>
+      <w:r>
+        <w:t xml:space="preserve">instead of</w:t>
+      </w:r>
+      <w:r>
+        <w:t xml:space="preserve"> </w:t>
+      </w:r>
+      <w:r>
+        <w:t xml:space="preserve">“Add Comment”</w:t>
+      </w:r>
+      <w:r>
+        <w:t xml:space="preserve"> </w:t>
+      </w:r>
+      <w:r>
+        <w:t xml:space="preserve">to post your comment and immediately get an AI response, or click</w:t>
+      </w:r>
+      <w:r>
+        <w:t xml:space="preserve"> </w:t>
+      </w:r>
+      <w:r>
+        <w:rPr>
+          <w:b/>
+          <w:bCs/>
+        </w:rPr>
+        <w:t xml:space="preserve">✨ Ask Copilot</w:t>
+      </w:r>
+      <w:r>
+        <w:t xml:space="preserve"> </w:t>
+      </w:r>
+      <w:r>
+        <w:t xml:space="preserve">next to</w:t>
+      </w:r>
+      <w:r>
+        <w:t xml:space="preserve"> </w:t>
+      </w:r>
+      <w:r>
+        <w:t xml:space="preserve">“Reply”</w:t>
+      </w:r>
+      <w:r>
+        <w:t xml:space="preserve"> </w:t>
+      </w:r>
+      <w:r>
+        <w:t xml:space="preserve">to send the entire thread to Copilot.</w:t>
       </w:r>
     </w:p>
     <w:bookmarkEnd w:id="14"/>
@@ -321,7 +377,7 @@
     </w:p>
     <w:bookmarkEnd w:id="15"/>
     <w:bookmarkEnd w:id="16"/>
-    <w:bookmarkStart w:id="25" w:name="features"/>
+    <w:bookmarkStart w:id="28" w:name="features"/>
     <w:p>
       <w:pPr>
         <w:pStyle w:val="Heading2"/>
@@ -330,31 +386,53 @@
         <w:t xml:space="preserve">Features</w:t>
       </w:r>
     </w:p>
-    <w:tbl>
-      <w:tblPr>
-        <w:tblStyle w:val="FigureTable"/>
-        <w:tblW w:type="auto" w:w="0"/>
-        <w:jc w:val="center"/>
-        <w:tblLook w:firstRow="0" w:lastRow="0" w:firstColumn="0" w:lastColumn="0"/>
-      </w:tblPr>
-      <w:tblGrid>
-        <w:gridCol w:w="7920"/>
-      </w:tblGrid>
-      <w:tr>
-        <w:tc>
-          <w:tcPr/>
-          <w:p>
-            <w:pPr>
-              <w:pStyle w:val="Compact"/>
-              <w:jc w:val="center"/>
-            </w:pPr>
-            <w:r>
-              <w:t xml:space="preserve">Markdown Review Preview</w:t>
-            </w:r>
-          </w:p>
-        </w:tc>
-      </w:tr>
-    </w:tbl>
+    <w:p>
+      <w:pPr>
+        <w:pStyle w:val="CaptionedFigure"/>
+      </w:pPr>
+      <w:r>
+        <w:drawing>
+          <wp:inline>
+            <wp:extent cx="5334000" cy="4202672"/>
+            <wp:effectExtent b="0" l="0" r="0" t="0"/>
+            <wp:docPr descr="Markdown Review Preview" title="" id="18" name="Picture"/>
+            <a:graphic>
+              <a:graphicData uri="http://schemas.openxmlformats.org/drawingml/2006/picture">
+                <pic:pic>
+                  <pic:nvPicPr>
+                    <pic:cNvPr descr="examples/screenshot.png" id="19" name="Picture"/>
+                    <pic:cNvPicPr>
+                      <a:picLocks noChangeArrowheads="1" noChangeAspect="1"/>
+                    </pic:cNvPicPr>
+                  </pic:nvPicPr>
+                  <pic:blipFill>
+                    <a:blip r:embed="rId17"/>
+                    <a:stretch>
+                      <a:fillRect/>
+                    </a:stretch>
+                  </pic:blipFill>
+                  <pic:spPr bwMode="auto">
+                    <a:xfrm>
+                      <a:off x="0" y="0"/>
+                      <a:ext cx="5334000" cy="4202672"/>
+                    </a:xfrm>
+                    <a:prstGeom prst="rect">
+                      <a:avLst/>
+                    </a:prstGeom>
+                    <a:noFill/>
+                    <a:ln w="9525">
+                      <a:noFill/>
+                      <a:headEnd/>
+                      <a:tailEnd/>
+                    </a:ln>
+                  </pic:spPr>
+                </pic:pic>
+              </a:graphicData>
+            </a:graphic>
+          </wp:inline>
+        </w:drawing>
+      </w:r>
+    </w:p>
     <w:p>
       <w:pPr>
         <w:pStyle w:val="ImageCaption"/>
@@ -363,7 +441,7 @@
         <w:t xml:space="preserve">Markdown Review Preview</w:t>
       </w:r>
     </w:p>
-    <w:bookmarkStart w:id="17" w:name="rich-rendering"/>
+    <w:bookmarkStart w:id="20" w:name="rich-rendering"/>
     <w:p>
       <w:pPr>
         <w:pStyle w:val="Heading3"/>
@@ -490,8 +568,8 @@
         <w:t xml:space="preserve">— Code blocks with language-specific formatting</w:t>
       </w:r>
     </w:p>
-    <w:bookmarkEnd w:id="17"/>
-    <w:bookmarkStart w:id="18" w:name="inline-commenting"/>
+    <w:bookmarkEnd w:id="20"/>
+    <w:bookmarkStart w:id="21" w:name="inline-commenting"/>
     <w:p>
       <w:pPr>
         <w:pStyle w:val="Heading3"/>
@@ -663,8 +741,8 @@
         <w:t xml:space="preserve">to send the comment/thread to Copilot Agent Mode for an AI response</w:t>
       </w:r>
     </w:p>
-    <w:bookmarkEnd w:id="18"/>
-    <w:bookmarkStart w:id="19" w:name="threaded-replies-with-roles"/>
+    <w:bookmarkEnd w:id="21"/>
+    <w:bookmarkStart w:id="22" w:name="threaded-replies-with-roles"/>
     <w:p>
       <w:pPr>
         <w:pStyle w:val="Heading3"/>
@@ -735,8 +813,8 @@
         <w:t xml:space="preserve">Edit comments and replies inline</w:t>
       </w:r>
     </w:p>
-    <w:bookmarkEnd w:id="19"/>
-    <w:bookmarkStart w:id="20" w:name="cross-reference-jumping"/>
+    <w:bookmarkEnd w:id="22"/>
+    <w:bookmarkStart w:id="23" w:name="cross-reference-jumping"/>
     <w:p>
       <w:pPr>
         <w:pStyle w:val="Heading3"/>
@@ -792,8 +870,8 @@
         <w:t xml:space="preserve">: Move your cursor in the editor and the preview scrolls to match</w:t>
       </w:r>
     </w:p>
-    <w:bookmarkEnd w:id="20"/>
-    <w:bookmarkStart w:id="21" w:name="export"/>
+    <w:bookmarkEnd w:id="23"/>
+    <w:bookmarkStart w:id="24" w:name="export"/>
     <w:p>
       <w:pPr>
         <w:pStyle w:val="Heading3"/>
@@ -846,8 +924,8 @@
         <w:t xml:space="preserve">— One-click export via Pandoc with native Word equations (OMML). Mermaid diagrams rendered as high-resolution (2x DPI) PNG images via Chrome headless.</w:t>
       </w:r>
     </w:p>
-    <w:bookmarkEnd w:id="21"/>
-    <w:bookmarkStart w:id="22" w:name="copilot-tools-for-agent-mode"/>
+    <w:bookmarkEnd w:id="24"/>
+    <w:bookmarkStart w:id="25" w:name="copilot-tools-for-agent-mode"/>
     <w:p>
       <w:pPr>
         <w:pStyle w:val="Heading3"/>
@@ -1293,8 +1371,8 @@
         <w:t xml:space="preserve">The agent receives the comment text, block context, and all existing replies, then uses the review tools to read full context and post its response.</w:t>
       </w:r>
     </w:p>
-    <w:bookmarkEnd w:id="22"/>
-    <w:bookmarkStart w:id="23" w:name="anchor-system"/>
+    <w:bookmarkEnd w:id="25"/>
+    <w:bookmarkStart w:id="26" w:name="anchor-system"/>
     <w:p>
       <w:pPr>
         <w:pStyle w:val="Heading3"/>
@@ -1455,8 +1533,8 @@
         <w:t xml:space="preserve">it or commit it for shared reviews.</w:t>
       </w:r>
     </w:p>
-    <w:bookmarkEnd w:id="23"/>
-    <w:bookmarkStart w:id="24" w:name="additional-features"/>
+    <w:bookmarkEnd w:id="26"/>
+    <w:bookmarkStart w:id="27" w:name="additional-features"/>
     <w:p>
       <w:pPr>
         <w:pStyle w:val="Heading3"/>
@@ -1640,9 +1718,9 @@
         </w:pict>
       </w:r>
     </w:p>
-    <w:bookmarkEnd w:id="24"/>
-    <w:bookmarkEnd w:id="25"/>
-    <w:bookmarkStart w:id="26" w:name="navigation-tips"/>
+    <w:bookmarkEnd w:id="27"/>
+    <w:bookmarkEnd w:id="28"/>
+    <w:bookmarkStart w:id="29" w:name="navigation-tips"/>
     <w:p>
       <w:pPr>
         <w:pStyle w:val="Heading2"/>
@@ -1764,8 +1842,8 @@
         </w:pict>
       </w:r>
     </w:p>
-    <w:bookmarkEnd w:id="26"/>
-    <w:bookmarkStart w:id="28" w:name="example"/>
+    <w:bookmarkEnd w:id="29"/>
+    <w:bookmarkStart w:id="31" w:name="example"/>
     <w:p>
       <w:pPr>
         <w:pStyle w:val="Heading2"/>
@@ -1784,7 +1862,7 @@
       <w:r>
         <w:t xml:space="preserve"> </w:t>
       </w:r>
-      <w:hyperlink r:id="rId27">
+      <w:hyperlink r:id="rId30">
         <w:r>
           <w:rPr>
             <w:rStyle w:val="Hyperlink"/>
@@ -1832,8 +1910,8 @@
         </w:pict>
       </w:r>
     </w:p>
-    <w:bookmarkEnd w:id="28"/>
-    <w:bookmarkStart w:id="30" w:name="requirements"/>
+    <w:bookmarkEnd w:id="31"/>
+    <w:bookmarkStart w:id="33" w:name="requirements"/>
     <w:p>
       <w:pPr>
         <w:pStyle w:val="Heading2"/>
@@ -1907,7 +1985,7 @@
       <w:r>
         <w:t xml:space="preserve">(optional) — for DOCX export with native Word equations (</w:t>
       </w:r>
-      <w:hyperlink r:id="rId29">
+      <w:hyperlink r:id="rId32">
         <w:r>
           <w:rPr>
             <w:rStyle w:val="Hyperlink"/>
@@ -1926,8 +2004,8 @@
         </w:pict>
       </w:r>
     </w:p>
-    <w:bookmarkEnd w:id="30"/>
-    <w:bookmarkStart w:id="31" w:name="extension-settings"/>
+    <w:bookmarkEnd w:id="33"/>
+    <w:bookmarkStart w:id="34" w:name="extension-settings"/>
     <w:p>
       <w:pPr>
         <w:pStyle w:val="Heading2"/>
@@ -1951,8 +2029,8 @@
         </w:pict>
       </w:r>
     </w:p>
-    <w:bookmarkEnd w:id="31"/>
-    <w:bookmarkStart w:id="32" w:name="architecture"/>
+    <w:bookmarkEnd w:id="34"/>
+    <w:bookmarkStart w:id="35" w:name="architecture"/>
     <w:p>
       <w:pPr>
         <w:pStyle w:val="Heading2"/>
@@ -2051,8 +2129,8 @@
         </w:pict>
       </w:r>
     </w:p>
-    <w:bookmarkEnd w:id="32"/>
-    <w:bookmarkStart w:id="33" w:name="development"/>
+    <w:bookmarkEnd w:id="35"/>
+    <w:bookmarkStart w:id="36" w:name="development"/>
     <w:p>
       <w:pPr>
         <w:pStyle w:val="Heading2"/>
@@ -2280,8 +2358,8 @@
         </w:pict>
       </w:r>
     </w:p>
-    <w:bookmarkEnd w:id="33"/>
-    <w:bookmarkStart w:id="34" w:name="version-history"/>
+    <w:bookmarkEnd w:id="36"/>
+    <w:bookmarkStart w:id="37" w:name="version-history"/>
     <w:p>
       <w:pPr>
         <w:pStyle w:val="Heading2"/>
@@ -2324,6 +2402,62 @@
             </w:pPr>
             <w:r>
               <w:t xml:space="preserve">Highlights</w:t>
+            </w:r>
+          </w:p>
+        </w:tc>
+      </w:tr>
+      <w:tr>
+        <w:tc>
+          <w:tcPr/>
+          <w:p>
+            <w:pPr>
+              <w:pStyle w:val="Compact"/>
+            </w:pPr>
+            <w:r>
+              <w:rPr>
+                <w:b/>
+                <w:bCs/>
+              </w:rPr>
+              <w:t xml:space="preserve">4.0.0</w:t>
+            </w:r>
+          </w:p>
+        </w:tc>
+        <w:tc>
+          <w:tcPr/>
+          <w:p>
+            <w:pPr>
+              <w:pStyle w:val="Compact"/>
+            </w:pPr>
+            <w:r>
+              <w:t xml:space="preserve">✨ Ask Copilot buttons (Add Comment + Reply), popover persistence, data URI images, DOCX table borders, reply delete with confirmation dialogs</w:t>
+            </w:r>
+          </w:p>
+        </w:tc>
+      </w:tr>
+      <w:tr>
+        <w:tc>
+          <w:tcPr/>
+          <w:p>
+            <w:pPr>
+              <w:pStyle w:val="Compact"/>
+            </w:pPr>
+            <w:r>
+              <w:rPr>
+                <w:b/>
+                <w:bCs/>
+              </w:rPr>
+              <w:t xml:space="preserve">3.7.x</w:t>
+            </w:r>
+          </w:p>
+        </w:tc>
+        <w:tc>
+          <w:tcPr/>
+          <w:p>
+            <w:pPr>
+              <w:pStyle w:val="Compact"/>
+            </w:pPr>
+            <w:r>
+              <w:t xml:space="preserve">Quick Start section, Ctrl+Shift+R keybinding, Mermaid diagrams, preview as new tab</w:t>
             </w:r>
           </w:p>
         </w:tc>
@@ -2532,8 +2666,8 @@
         </w:pict>
       </w:r>
     </w:p>
-    <w:bookmarkEnd w:id="34"/>
-    <w:bookmarkStart w:id="36" w:name="license"/>
+    <w:bookmarkEnd w:id="37"/>
+    <w:bookmarkStart w:id="39" w:name="license"/>
     <w:p>
       <w:pPr>
         <w:pStyle w:val="Heading2"/>
@@ -2546,7 +2680,7 @@
       <w:pPr>
         <w:pStyle w:val="FirstParagraph"/>
       </w:pPr>
-      <w:hyperlink r:id="rId35">
+      <w:hyperlink r:id="rId38">
         <w:r>
           <w:rPr>
             <w:rStyle w:val="Hyperlink"/>
@@ -2555,8 +2689,8 @@
         </w:r>
       </w:hyperlink>
     </w:p>
-    <w:bookmarkEnd w:id="36"/>
-    <w:bookmarkEnd w:id="37"/>
+    <w:bookmarkEnd w:id="39"/>
+    <w:bookmarkEnd w:id="40"/>
     <w:sectPr>
       <w:footnotePr>
         <w:numRestart w:val="eachSect"/>

</xml_diff>